<commit_message>
Clean repo and update theory paper
</commit_message>
<xml_diff>
--- a/TCL-Theory-Paper-Theoretical-Framework.docx
+++ b/TCL-Theory-Paper-Theoretical-Framework.docx
@@ -79,14 +79,10 @@
       </w:pPr>
       <w:r>
         <w:rPr>
-          <w:rFonts w:ascii="Arial" w:cs="Arial" w:eastAsia="Arial" w:hAnsi="Arial"/>
-          <w:b/>
-          <w:bCs/>
-          <w:color w:val="1F2937"/>
-          <w:sz w:val="24"/>
-          <w:szCs w:val="24"/>
-        </w:rPr>
-        <w:t xml:space="preserve">[Author Name]</w:t>
+          <w:color w:val="000000"/>
+          <w:sz w:val="22"/>
+        </w:rPr>
+        <w:t>Awab Mohamed</w:t>
       </w:r>
     </w:p>
     <w:p>
@@ -299,13 +295,17 @@
         <w:jc w:val="both"/>
       </w:pPr>
       <w:r>
-        <w:rPr>
-          <w:rFonts w:ascii="Times New Roman" w:cs="Times New Roman" w:eastAsia="Times New Roman" w:hAnsi="Times New Roman"/>
-          <w:color w:val="1F2937"/>
-          <w:sz w:val="24"/>
-          <w:szCs w:val="24"/>
-        </w:rPr>
-        <w:t xml:space="preserve">This paper proposes the Truth Calibration Layer (TCL) as a theoretical architecture and research hypothesis: a lightweight calibration probe attached to frozen LLM hidden states for claim-level reliability estimation. No practical implementation is claimed in this version of the work. The purpose of the paper is to define the theoretical motivation, architecture, assumptions, and future validation path before moving to implementation.</w:t>
+        <w:t>This paper proposes the Truth Calibration Layer (TCL) as a theoretical architecture and research hypothesis: a lightweight calibration framework attached to frozen LLM hidden states for claim-level reliability estimation. The full TCL framework, including the proposed four-dimensional trust vector, is not claimed as implemented or validated in this version of the work. The purpose of the paper is to define the theoretical motivation, architecture, assumptions, and validation path while keeping empirical claims separate from the theory-stage proposal.</w:t>
+      </w:r>
+    </w:p>
+    <w:p>
+      <w:pPr>
+        <w:spacing w:before="60" w:after="160"/>
+        <w:jc w:val="both"/>
+      </w:pPr>
+      <w:r>
+        <w:rPr/>
+        <w:t>Current empirical status: a narrow preliminary companion diagnostic, TCL-v0, has been prepared separately to test whether frozen hidden states can predict answer correctness better than raw generation confidence. TCL-v0 should be read as an early confidence-only diagnostic, not as an implementation or validation of the full TCL framework.</w:t>
       </w:r>
     </w:p>
     <w:p>
@@ -426,13 +426,7 @@
         <w:spacing w:after="60" w:before="60"/>
       </w:pPr>
       <w:r>
-        <w:rPr>
-          <w:rFonts w:ascii="Times New Roman" w:cs="Times New Roman" w:eastAsia="Times New Roman" w:hAnsi="Times New Roman"/>
-          <w:color w:val="1F2937"/>
-          <w:sz w:val="24"/>
-          <w:szCs w:val="24"/>
-        </w:rPr>
-        <w:t xml:space="preserve">We propose a detailed future experimental protocol for validating TCL against Expected Calibration Error on standard factual QA benchmarks.</w:t>
+        <w:t>We propose a future validation protocol for full TCL and identify TCL-v0 as a narrow preliminary diagnostic for testing hidden-state correctness signals before broader implementation.</w:t>
       </w:r>
     </w:p>
     <w:p>
@@ -1926,13 +1920,7 @@
         <w:jc w:val="both"/>
       </w:pPr>
       <w:r>
-        <w:rPr>
-          <w:rFonts w:ascii="Times New Roman" w:cs="Times New Roman" w:eastAsia="Times New Roman" w:hAnsi="Times New Roman"/>
-          <w:color w:val="1F2937"/>
-          <w:sz w:val="24"/>
-          <w:szCs w:val="24"/>
-        </w:rPr>
-        <w:t xml:space="preserve">Because TCL has not yet been implemented, this section defines a future experimental protocol rather than reporting completed results. The proposed protocol would evaluate TCL attached to Mistral-7B-Instruct-v0.3 and LLaMA-3.1-8B-Instruct, with both models loaded in 4-bit quantisation and frozen base weights.</w:t>
+        <w:t>Because full TCL has not yet been implemented, this section defines a future experimental protocol rather than reporting completed full-system results. The separate TCL-v0 diagnostic begins with a narrower question: whether frozen hidden states can support a correctness-confidence score that improves on raw generation confidence. Future full-TCL validation would evaluate the proposed trust-vector architecture attached to larger instruction models such as Mistral-7B-Instruct-v0.3 and LLaMA-3.1-8B-Instruct, with frozen base weights where appropriate.</w:t>
       </w:r>
     </w:p>
     <w:p>
@@ -2721,13 +2709,7 @@
         <w:jc w:val="both"/>
       </w:pPr>
       <w:r>
-        <w:rPr>
-          <w:rFonts w:ascii="Times New Roman" w:cs="Times New Roman" w:eastAsia="Times New Roman" w:hAnsi="Times New Roman"/>
-          <w:color w:val="1F2937"/>
-          <w:sz w:val="24"/>
-          <w:szCs w:val="24"/>
-        </w:rPr>
-        <w:t xml:space="preserve">At the current stage, TCL should be understood as a theoretical framework rather than a working system. If later implemented and validated, it could represent a step toward AI systems that are not merely fluent but more transparent about uncertainty - systems that can expose reliability estimates alongside generated text. This framing is intentionally cautious: TCL does not make a model truthful by itself, and it should not be treated as a substitute for external verification in high-stakes domains.</w:t>
+        <w:t>At the current stage, full TCL should be understood as a theoretical framework rather than a working system. TCL-v0 is a separate early diagnostic that probes one narrow part of the hypothesis: whether hidden states contain useful signal for answer-correctness calibration. If the broader framework is later implemented and validated, it could represent a step toward AI systems that are not merely fluent but more transparent about uncertainty - systems that can expose reliability estimates alongside generated text. This framing is intentionally cautious: TCL does not make a model truthful by itself, and it should not be treated as a substitute for external verification in high-stakes domains.</w:t>
       </w:r>
     </w:p>
     <w:p>
@@ -2944,13 +2926,7 @@
         <w:jc w:val="both"/>
       </w:pPr>
       <w:r>
-        <w:rPr>
-          <w:rFonts w:ascii="Times New Roman" w:cs="Times New Roman" w:eastAsia="Times New Roman" w:hAnsi="Times New Roman"/>
-          <w:color w:val="1F2937"/>
-          <w:sz w:val="24"/>
-          <w:szCs w:val="24"/>
-        </w:rPr>
-        <w:t xml:space="preserve">The current contribution is conceptual: it defines the motivation, architecture, trust-vector dimensions, training objective, and validation plan. The next stage of the work is practical implementation, followed by empirical testing to determine whether the proposed TCL head actually improves calibration on factual QA benchmarks.</w:t>
+        <w:t>The current contribution remains primarily conceptual: it defines the motivation, architecture, trust-vector dimensions, training objective, and validation plan. The immediate practical bridge is TCL-v0, a limited confidence-only diagnostic using frozen hidden states and a lightweight probe. The next stage of the research is broader empirical testing to determine whether these preliminary hidden-state calibration signals remain useful across stronger models, datasets, and evaluation protocols before making any claims about full TCL.</w:t>
       </w:r>
     </w:p>
     <w:p>
@@ -3216,6 +3192,7 @@
         <w:t xml:space="preserve">[16] Zhao, Z., et al. (2021). Calibrate before use: Improving few-shot performance of language models. In Proceedings of ICML.</w:t>
       </w:r>
     </w:p>
+    <w:p/>
     <w:sectPr>
       <w:headerReference w:type="default" r:id="rId7"/>
       <w:footerReference w:type="default" r:id="rId8"/>

</xml_diff>